<commit_message>
requirements updated for subsystem tests
</commit_message>
<xml_diff>
--- a/5_Subsystem Tests/PM4_FS26_Subsystem_Test_Plan.docx
+++ b/5_Subsystem Tests/PM4_FS26_Subsystem_Test_Plan.docx
@@ -1,6 +1,6 @@
 
 <file path=word/document.xml><?xml version="1.0" encoding="utf-8"?>
-<w:document xmlns:wpc="http://schemas.microsoft.com/office/word/2010/wordprocessingCanvas" xmlns:cx="http://schemas.microsoft.com/office/drawing/2014/chartex" xmlns:cx1="http://schemas.microsoft.com/office/drawing/2015/9/8/chartex" xmlns:cx2="http://schemas.microsoft.com/office/drawing/2015/10/21/chartex" xmlns:cx3="http://schemas.microsoft.com/office/drawing/2016/5/9/chartex" xmlns:cx4="http://schemas.microsoft.com/office/drawing/2016/5/10/chartex" xmlns:cx5="http://schemas.microsoft.com/office/drawing/2016/5/11/chartex" xmlns:cx6="http://schemas.microsoft.com/office/drawing/2016/5/12/chartex" xmlns:cx7="http://schemas.microsoft.com/office/drawing/2016/5/13/chartex" xmlns:cx8="http://schemas.microsoft.com/office/drawing/2016/5/14/chartex" xmlns:mc="http://schemas.openxmlformats.org/markup-compatibility/2006" xmlns:aink="http://schemas.microsoft.com/office/drawing/2016/ink" xmlns:am3d="http://schemas.microsoft.com/office/drawing/2017/model3d" xmlns:o="urn:schemas-microsoft-com:office:office" xmlns:r="http://schemas.openxmlformats.org/officeDocument/2006/relationships" xmlns:m="http://schemas.openxmlformats.org/officeDocument/2006/math" xmlns:v="urn:schemas-microsoft-com:vml" xmlns:wp14="http://schemas.microsoft.com/office/word/2010/wordprocessingDrawing" xmlns:wp="http://schemas.openxmlformats.org/drawingml/2006/wordprocessingDrawing" xmlns:w10="urn:schemas-microsoft-com:office:word" xmlns:w="http://schemas.openxmlformats.org/wordprocessingml/2006/main" xmlns:w14="http://schemas.microsoft.com/office/word/2010/wordml" xmlns:w15="http://schemas.microsoft.com/office/word/2012/wordml" xmlns:w16cex="http://schemas.microsoft.com/office/word/2018/wordml/cex" xmlns:w16cid="http://schemas.microsoft.com/office/word/2016/wordml/cid" xmlns:w16="http://schemas.microsoft.com/office/word/2018/wordml" xmlns:w16se="http://schemas.microsoft.com/office/word/2015/wordml/symex" xmlns:wpg="http://schemas.microsoft.com/office/word/2010/wordprocessingGroup" xmlns:wpi="http://schemas.microsoft.com/office/word/2010/wordprocessingInk" xmlns:wne="http://schemas.microsoft.com/office/word/2006/wordml" xmlns:wps="http://schemas.microsoft.com/office/word/2010/wordprocessingShape" mc:Ignorable="w14 w15 w16se w16cid w16 w16cex wp14">
+<w:document xmlns:wpc="http://schemas.microsoft.com/office/word/2010/wordprocessingCanvas" xmlns:cx="http://schemas.microsoft.com/office/drawing/2014/chartex" xmlns:cx1="http://schemas.microsoft.com/office/drawing/2015/9/8/chartex" xmlns:cx2="http://schemas.microsoft.com/office/drawing/2015/10/21/chartex" xmlns:cx3="http://schemas.microsoft.com/office/drawing/2016/5/9/chartex" xmlns:cx4="http://schemas.microsoft.com/office/drawing/2016/5/10/chartex" xmlns:cx5="http://schemas.microsoft.com/office/drawing/2016/5/11/chartex" xmlns:cx6="http://schemas.microsoft.com/office/drawing/2016/5/12/chartex" xmlns:cx7="http://schemas.microsoft.com/office/drawing/2016/5/13/chartex" xmlns:cx8="http://schemas.microsoft.com/office/drawing/2016/5/14/chartex" xmlns:mc="http://schemas.openxmlformats.org/markup-compatibility/2006" xmlns:aink="http://schemas.microsoft.com/office/drawing/2016/ink" xmlns:am3d="http://schemas.microsoft.com/office/drawing/2017/model3d" xmlns:o="urn:schemas-microsoft-com:office:office" xmlns:oel="http://schemas.microsoft.com/office/2019/extlst" xmlns:r="http://schemas.openxmlformats.org/officeDocument/2006/relationships" xmlns:m="http://schemas.openxmlformats.org/officeDocument/2006/math" xmlns:v="urn:schemas-microsoft-com:vml" xmlns:wp14="http://schemas.microsoft.com/office/word/2010/wordprocessingDrawing" xmlns:wp="http://schemas.openxmlformats.org/drawingml/2006/wordprocessingDrawing" xmlns:w10="urn:schemas-microsoft-com:office:word" xmlns:w="http://schemas.openxmlformats.org/wordprocessingml/2006/main" xmlns:w14="http://schemas.microsoft.com/office/word/2010/wordml" xmlns:w15="http://schemas.microsoft.com/office/word/2012/wordml" xmlns:w16cex="http://schemas.microsoft.com/office/word/2018/wordml/cex" xmlns:w16cid="http://schemas.microsoft.com/office/word/2016/wordml/cid" xmlns:w16="http://schemas.microsoft.com/office/word/2018/wordml" xmlns:w16du="http://schemas.microsoft.com/office/word/2023/wordml/word16du" xmlns:w16sdtdh="http://schemas.microsoft.com/office/word/2020/wordml/sdtdatahash" xmlns:w16sdtfl="http://schemas.microsoft.com/office/word/2024/wordml/sdtformatlock" xmlns:w16se="http://schemas.microsoft.com/office/word/2015/wordml/symex" xmlns:wpg="http://schemas.microsoft.com/office/word/2010/wordprocessingGroup" xmlns:wpi="http://schemas.microsoft.com/office/word/2010/wordprocessingInk" xmlns:wne="http://schemas.microsoft.com/office/word/2006/wordml" xmlns:wps="http://schemas.microsoft.com/office/word/2010/wordprocessingShape" mc:Ignorable="w14 w15 w16se w16cid w16 w16cex w16sdtdh w16sdtfl w16du wp14">
   <w:body>
     <w:p>
       <w:pPr>
@@ -32,6 +32,16 @@
         </w:rPr>
         <w:t xml:space="preserve"> Plan</w:t>
       </w:r>
+      <w:r>
+        <w:rPr>
+          <w:b/>
+          <w:bCs/>
+          <w:sz w:val="32"/>
+          <w:szCs w:val="32"/>
+          <w:lang w:val="en-GB"/>
+        </w:rPr>
+        <w:t xml:space="preserve"> Example</w:t>
+      </w:r>
     </w:p>
     <w:p>
       <w:pPr>
@@ -47,47 +57,7 @@
           <w:szCs w:val="24"/>
           <w:lang w:val="en-GB"/>
         </w:rPr>
-        <w:t xml:space="preserve">Sensor board </w:t>
-      </w:r>
-      <w:r>
-        <w:rPr>
-          <w:sz w:val="24"/>
-          <w:szCs w:val="24"/>
-          <w:lang w:val="en-GB"/>
-        </w:rPr>
-        <w:t xml:space="preserve">is not connected to the </w:t>
-      </w:r>
-      <w:r>
-        <w:rPr>
-          <w:sz w:val="24"/>
-          <w:szCs w:val="24"/>
-          <w:lang w:val="en-GB"/>
-        </w:rPr>
-        <w:t>M</w:t>
-      </w:r>
-      <w:r>
-        <w:rPr>
-          <w:sz w:val="24"/>
-          <w:szCs w:val="24"/>
-          <w:lang w:val="en-GB"/>
-        </w:rPr>
-        <w:t>icrocontroller</w:t>
-      </w:r>
-      <w:r>
-        <w:rPr>
-          <w:sz w:val="24"/>
-          <w:szCs w:val="24"/>
-          <w:lang w:val="en-GB"/>
-        </w:rPr>
-        <w:t>-board</w:t>
-      </w:r>
-      <w:r>
-        <w:rPr>
-          <w:sz w:val="24"/>
-          <w:szCs w:val="24"/>
-          <w:lang w:val="en-GB"/>
-        </w:rPr>
-        <w:t>, References: HW_Testing.docx (PM3), Checklist_Marks.xlsx (PM4)</w:t>
+        <w:t xml:space="preserve">References: HW_Testing.docx , Checklist_Marks.xlsx </w:t>
       </w:r>
     </w:p>
     <w:tbl>
@@ -461,17 +431,8 @@
               <w:rPr>
                 <w:lang w:val="en-GB"/>
               </w:rPr>
-              <w:t xml:space="preserve">50 </w:t>
-            </w:r>
-            <w:proofErr w:type="spellStart"/>
-            <w:proofErr w:type="gramStart"/>
-            <w:r>
-              <w:rPr>
-                <w:lang w:val="en-GB"/>
-              </w:rPr>
-              <w:t>uVpp</w:t>
-            </w:r>
-            <w:proofErr w:type="spellEnd"/>
+              <w:t>50 uVpp</w:t>
+            </w:r>
             <w:r>
               <w:rPr>
                 <w:lang w:val="en-GB"/>
@@ -482,14 +443,7 @@
               <w:rPr>
                 <w:lang w:val="en-GB"/>
               </w:rPr>
-              <w:t xml:space="preserve"> &amp;</w:t>
-            </w:r>
-            <w:proofErr w:type="gramEnd"/>
-            <w:r>
-              <w:rPr>
-                <w:lang w:val="en-GB"/>
-              </w:rPr>
-              <w:t xml:space="preserve"> </w:t>
+              <w:t xml:space="preserve"> &amp; </w:t>
             </w:r>
             <w:r>
               <w:rPr>
@@ -1013,7 +967,6 @@
                 <w:lang w:val="en-US"/>
               </w:rPr>
             </w:pPr>
-            <w:proofErr w:type="spellStart"/>
             <w:r>
               <w:rPr>
                 <w:b/>
@@ -1040,15 +993,7 @@
                 <w:b/>
                 <w:lang w:val="en-US"/>
               </w:rPr>
-              <w:t>ignal</w:t>
-            </w:r>
-            <w:proofErr w:type="spellEnd"/>
-            <w:r>
-              <w:rPr>
-                <w:b/>
-                <w:lang w:val="en-US"/>
-              </w:rPr>
-              <w:t xml:space="preserve"> Gain</w:t>
+              <w:t>ignal Gain</w:t>
             </w:r>
             <w:r>
               <w:rPr>
@@ -1136,14 +1081,7 @@
               <w:rPr>
                 <w:lang w:val="en-US"/>
               </w:rPr>
-              <w:t xml:space="preserve"> </w:t>
-            </w:r>
-            <w:proofErr w:type="spellStart"/>
-            <w:r>
-              <w:rPr>
-                <w:lang w:val="en-US"/>
-              </w:rPr>
-              <w:t>f</w:t>
+              <w:t xml:space="preserve"> f</w:t>
             </w:r>
             <w:r>
               <w:rPr>
@@ -1152,7 +1090,6 @@
               </w:rPr>
               <w:t>d</w:t>
             </w:r>
-            <w:proofErr w:type="spellEnd"/>
             <w:r>
               <w:rPr>
                 <w:lang w:val="en-US"/>
@@ -1421,21 +1358,7 @@
         <w:rPr>
           <w:lang w:val="en-GB"/>
         </w:rPr>
-        <w:t>(</w:t>
-      </w:r>
-      <w:proofErr w:type="spellStart"/>
-      <w:r>
-        <w:rPr>
-          <w:lang w:val="en-GB"/>
-        </w:rPr>
-        <w:t>PicoScope</w:t>
-      </w:r>
-      <w:proofErr w:type="spellEnd"/>
-      <w:r>
-        <w:rPr>
-          <w:lang w:val="en-GB"/>
-        </w:rPr>
-        <w:t xml:space="preserve"> 2206B: </w:t>
+        <w:t xml:space="preserve">(PicoScope 2206B: </w:t>
       </w:r>
       <w:hyperlink r:id="rId6" w:history="1">
         <w:r>
@@ -1505,14 +1428,7 @@
         <w:rPr>
           <w:lang w:val="en-GB"/>
         </w:rPr>
-        <w:t xml:space="preserve">or </w:t>
-      </w:r>
-      <w:proofErr w:type="spellStart"/>
-      <w:r>
-        <w:rPr>
-          <w:lang w:val="en-GB"/>
-        </w:rPr>
-        <w:t>Pico</w:t>
+        <w:t>or Pico</w:t>
       </w:r>
       <w:r>
         <w:rPr>
@@ -1524,14 +1440,7 @@
         <w:rPr>
           <w:lang w:val="en-GB"/>
         </w:rPr>
-        <w:t>cope</w:t>
-      </w:r>
-      <w:proofErr w:type="spellEnd"/>
-      <w:r>
-        <w:rPr>
-          <w:lang w:val="en-GB"/>
-        </w:rPr>
-        <w:t xml:space="preserve">: </w:t>
+        <w:t xml:space="preserve">cope: </w:t>
       </w:r>
       <w:hyperlink r:id="rId7" w:history="1">
         <w:r>
@@ -1644,6 +1553,16 @@
         </w:rPr>
         <w:t xml:space="preserve"> Plan</w:t>
       </w:r>
+      <w:r>
+        <w:rPr>
+          <w:b/>
+          <w:bCs/>
+          <w:sz w:val="32"/>
+          <w:szCs w:val="32"/>
+          <w:lang w:val="en-GB"/>
+        </w:rPr>
+        <w:t xml:space="preserve"> Example</w:t>
+      </w:r>
     </w:p>
     <w:p>
       <w:pPr>
@@ -1659,47 +1578,7 @@
           <w:szCs w:val="24"/>
           <w:lang w:val="en-GB"/>
         </w:rPr>
-        <w:t>Microcontroller-board</w:t>
-      </w:r>
-      <w:r>
-        <w:rPr>
-          <w:sz w:val="24"/>
-          <w:szCs w:val="24"/>
-          <w:lang w:val="en-GB"/>
-        </w:rPr>
-        <w:t xml:space="preserve"> </w:t>
-      </w:r>
-      <w:r>
-        <w:rPr>
-          <w:sz w:val="24"/>
-          <w:szCs w:val="24"/>
-          <w:lang w:val="en-GB"/>
-        </w:rPr>
-        <w:t>is not connected to the</w:t>
-      </w:r>
-      <w:r>
-        <w:rPr>
-          <w:sz w:val="24"/>
-          <w:szCs w:val="24"/>
-          <w:lang w:val="en-GB"/>
-        </w:rPr>
-        <w:t xml:space="preserve"> </w:t>
-      </w:r>
-      <w:r>
-        <w:rPr>
-          <w:sz w:val="24"/>
-          <w:szCs w:val="24"/>
-          <w:lang w:val="en-GB"/>
-        </w:rPr>
-        <w:t>Sensor board</w:t>
-      </w:r>
-      <w:r>
-        <w:rPr>
-          <w:sz w:val="24"/>
-          <w:szCs w:val="24"/>
-          <w:lang w:val="en-GB"/>
-        </w:rPr>
-        <w:t>, References: HW_Testing.docx (PM3), Checklist_Marks.xlsx (PM4)</w:t>
+        <w:t xml:space="preserve">References: HW_Testing.docx, Checklist_Marks.xlsx </w:t>
       </w:r>
     </w:p>
     <w:tbl>
@@ -2180,16 +2059,8 @@
                 <w:lang w:val="en-US"/>
               </w:rPr>
               <w:br/>
-              <w:t xml:space="preserve">… Hz, … </w:t>
-            </w:r>
-            <w:proofErr w:type="spellStart"/>
-            <w:r>
-              <w:rPr>
-                <w:lang w:val="en-US"/>
-              </w:rPr>
-              <w:t>Vpp</w:t>
-            </w:r>
-            <w:proofErr w:type="spellEnd"/>
+              <w:t>… Hz, … Vpp</w:t>
+            </w:r>
           </w:p>
         </w:tc>
         <w:tc>
@@ -2347,71 +2218,33 @@
                 <w:lang w:val="en-US"/>
               </w:rPr>
               <w:br/>
-              <w:t xml:space="preserve"> … Hz, … </w:t>
-            </w:r>
-            <w:proofErr w:type="spellStart"/>
-            <w:r>
-              <w:rPr>
-                <w:lang w:val="en-US"/>
-              </w:rPr>
-              <w:t>Vpp</w:t>
-            </w:r>
-            <w:proofErr w:type="spellEnd"/>
-            <w:r>
-              <w:rPr>
-                <w:lang w:val="en-US"/>
-              </w:rPr>
-              <w:t> </w:t>
-            </w:r>
-          </w:p>
-        </w:tc>
-        <w:tc>
-          <w:tcPr>
-            <w:tcW w:w="2362" w:type="dxa"/>
-          </w:tcPr>
-          <w:p>
-            <w:pPr>
-              <w:spacing w:before="60" w:after="60"/>
-              <w:rPr>
-                <w:lang w:val="en-US"/>
-              </w:rPr>
-            </w:pPr>
-            <w:proofErr w:type="gramStart"/>
+              <w:t xml:space="preserve"> … Hz, … Vpp </w:t>
+            </w:r>
+          </w:p>
+        </w:tc>
+        <w:tc>
+          <w:tcPr>
+            <w:tcW w:w="2362" w:type="dxa"/>
+          </w:tcPr>
+          <w:p>
+            <w:pPr>
+              <w:spacing w:before="60" w:after="60"/>
+              <w:rPr>
+                <w:lang w:val="en-US"/>
+              </w:rPr>
+            </w:pPr>
             <w:r>
               <w:rPr>
                 <w:rFonts w:cstheme="minorHAnsi"/>
                 <w:lang w:val="en-US"/>
               </w:rPr>
-              <w:t>Frequency  +</w:t>
-            </w:r>
-            <w:proofErr w:type="gramEnd"/>
-            <w:r>
-              <w:rPr>
-                <w:rFonts w:cstheme="minorHAnsi"/>
-                <w:lang w:val="en-US"/>
-              </w:rPr>
-              <w:t xml:space="preserve">… ± </w:t>
-            </w:r>
-            <w:proofErr w:type="spellStart"/>
-            <w:r>
-              <w:rPr>
-                <w:rFonts w:cstheme="minorHAnsi"/>
-                <w:lang w:val="en-US"/>
-              </w:rPr>
-              <w:t>Δ</w:t>
-            </w:r>
-            <w:r>
-              <w:rPr>
-                <w:lang w:val="en-US"/>
-              </w:rPr>
-              <w:t>f</w:t>
-            </w:r>
-            <w:proofErr w:type="spellEnd"/>
-            <w:r>
-              <w:rPr>
-                <w:lang w:val="en-US"/>
-              </w:rPr>
-              <w:t>/2</w:t>
+              <w:t>Frequency  +… ± Δ</w:t>
+            </w:r>
+            <w:r>
+              <w:rPr>
+                <w:lang w:val="en-US"/>
+              </w:rPr>
+              <w:t>f/2</w:t>
             </w:r>
             <w:r>
               <w:rPr>
@@ -2420,7 +2253,6 @@
               <w:br/>
               <w:t>(</w:t>
             </w:r>
-            <w:proofErr w:type="spellStart"/>
             <w:r>
               <w:rPr>
                 <w:rFonts w:cstheme="minorHAnsi"/>
@@ -2432,14 +2264,7 @@
               <w:rPr>
                 <w:lang w:val="en-US"/>
               </w:rPr>
-              <w:t>f</w:t>
-            </w:r>
-            <w:proofErr w:type="spellEnd"/>
-            <w:r>
-              <w:rPr>
-                <w:lang w:val="en-US"/>
-              </w:rPr>
-              <w:t xml:space="preserve"> = fs/NFFT)</w:t>
+              <w:t>f = fs/NFFT)</w:t>
             </w:r>
           </w:p>
         </w:tc>
@@ -2616,21 +2441,7 @@
               <w:rPr>
                 <w:lang w:val="en-US"/>
               </w:rPr>
-              <w:t xml:space="preserve">s from </w:t>
-            </w:r>
-            <w:proofErr w:type="spellStart"/>
-            <w:r>
-              <w:rPr>
-                <w:lang w:val="en-US"/>
-              </w:rPr>
-              <w:t>Matlab</w:t>
-            </w:r>
-            <w:proofErr w:type="spellEnd"/>
-            <w:r>
-              <w:rPr>
-                <w:lang w:val="en-US"/>
-              </w:rPr>
-              <w:t xml:space="preserve"> and USB-Audio Interface</w:t>
+              <w:t>s from Matlab and USB-Audio Interface</w:t>
             </w:r>
             <w:r>
               <w:rPr>
@@ -2648,21 +2459,7 @@
               <w:rPr>
                 <w:lang w:val="en-US"/>
               </w:rPr>
-              <w:t xml:space="preserve">… Hz, … </w:t>
-            </w:r>
-            <w:proofErr w:type="spellStart"/>
-            <w:r>
-              <w:rPr>
-                <w:lang w:val="en-US"/>
-              </w:rPr>
-              <w:t>Vpp</w:t>
-            </w:r>
-            <w:proofErr w:type="spellEnd"/>
-            <w:r>
-              <w:rPr>
-                <w:lang w:val="en-US"/>
-              </w:rPr>
-              <w:t> </w:t>
+              <w:t>… Hz, … Vpp </w:t>
             </w:r>
           </w:p>
         </w:tc>
@@ -2678,42 +2475,18 @@
                 <w:lang w:val="en-US"/>
               </w:rPr>
             </w:pPr>
-            <w:proofErr w:type="gramStart"/>
             <w:r>
               <w:rPr>
                 <w:rFonts w:cstheme="minorHAnsi"/>
                 <w:lang w:val="en-US"/>
               </w:rPr>
-              <w:t>Frequency  …</w:t>
-            </w:r>
-            <w:proofErr w:type="gramEnd"/>
-            <w:r>
-              <w:rPr>
-                <w:rFonts w:cstheme="minorHAnsi"/>
-                <w:lang w:val="en-US"/>
-              </w:rPr>
-              <w:t xml:space="preserve"> ± </w:t>
-            </w:r>
-            <w:proofErr w:type="spellStart"/>
-            <w:r>
-              <w:rPr>
-                <w:rFonts w:cstheme="minorHAnsi"/>
-                <w:lang w:val="en-US"/>
-              </w:rPr>
-              <w:t>Δ</w:t>
-            </w:r>
-            <w:r>
-              <w:rPr>
-                <w:lang w:val="en-US"/>
-              </w:rPr>
-              <w:t>f</w:t>
-            </w:r>
-            <w:proofErr w:type="spellEnd"/>
-            <w:r>
-              <w:rPr>
-                <w:lang w:val="en-US"/>
-              </w:rPr>
-              <w:t>/2</w:t>
+              <w:t>Frequency  … ± Δ</w:t>
+            </w:r>
+            <w:r>
+              <w:rPr>
+                <w:lang w:val="en-US"/>
+              </w:rPr>
+              <w:t>f/2</w:t>
             </w:r>
             <w:r>
               <w:rPr>
@@ -2722,7 +2495,6 @@
               <w:br/>
               <w:t>(</w:t>
             </w:r>
-            <w:proofErr w:type="spellStart"/>
             <w:r>
               <w:rPr>
                 <w:rFonts w:cstheme="minorHAnsi"/>
@@ -2734,14 +2506,7 @@
               <w:rPr>
                 <w:lang w:val="en-US"/>
               </w:rPr>
-              <w:t>f</w:t>
-            </w:r>
-            <w:proofErr w:type="spellEnd"/>
-            <w:r>
-              <w:rPr>
-                <w:lang w:val="en-US"/>
-              </w:rPr>
-              <w:t xml:space="preserve"> = fs/NFFT)</w:t>
+              <w:t>f = fs/NFFT)</w:t>
             </w:r>
           </w:p>
         </w:tc>
@@ -2945,7 +2710,7 @@
 </file>
 
 <file path=word/endnotes.xml><?xml version="1.0" encoding="utf-8"?>
-<w:endnotes xmlns:wpc="http://schemas.microsoft.com/office/word/2010/wordprocessingCanvas" xmlns:cx="http://schemas.microsoft.com/office/drawing/2014/chartex" xmlns:cx1="http://schemas.microsoft.com/office/drawing/2015/9/8/chartex" xmlns:cx2="http://schemas.microsoft.com/office/drawing/2015/10/21/chartex" xmlns:cx3="http://schemas.microsoft.com/office/drawing/2016/5/9/chartex" xmlns:cx4="http://schemas.microsoft.com/office/drawing/2016/5/10/chartex" xmlns:cx5="http://schemas.microsoft.com/office/drawing/2016/5/11/chartex" xmlns:cx6="http://schemas.microsoft.com/office/drawing/2016/5/12/chartex" xmlns:cx7="http://schemas.microsoft.com/office/drawing/2016/5/13/chartex" xmlns:cx8="http://schemas.microsoft.com/office/drawing/2016/5/14/chartex" xmlns:mc="http://schemas.openxmlformats.org/markup-compatibility/2006" xmlns:aink="http://schemas.microsoft.com/office/drawing/2016/ink" xmlns:am3d="http://schemas.microsoft.com/office/drawing/2017/model3d" xmlns:o="urn:schemas-microsoft-com:office:office" xmlns:r="http://schemas.openxmlformats.org/officeDocument/2006/relationships" xmlns:m="http://schemas.openxmlformats.org/officeDocument/2006/math" xmlns:v="urn:schemas-microsoft-com:vml" xmlns:wp14="http://schemas.microsoft.com/office/word/2010/wordprocessingDrawing" xmlns:wp="http://schemas.openxmlformats.org/drawingml/2006/wordprocessingDrawing" xmlns:w10="urn:schemas-microsoft-com:office:word" xmlns:w="http://schemas.openxmlformats.org/wordprocessingml/2006/main" xmlns:w14="http://schemas.microsoft.com/office/word/2010/wordml" xmlns:w15="http://schemas.microsoft.com/office/word/2012/wordml" xmlns:w16cex="http://schemas.microsoft.com/office/word/2018/wordml/cex" xmlns:w16cid="http://schemas.microsoft.com/office/word/2016/wordml/cid" xmlns:w16="http://schemas.microsoft.com/office/word/2018/wordml" xmlns:w16se="http://schemas.microsoft.com/office/word/2015/wordml/symex" xmlns:wpg="http://schemas.microsoft.com/office/word/2010/wordprocessingGroup" xmlns:wpi="http://schemas.microsoft.com/office/word/2010/wordprocessingInk" xmlns:wne="http://schemas.microsoft.com/office/word/2006/wordml" xmlns:wps="http://schemas.microsoft.com/office/word/2010/wordprocessingShape" mc:Ignorable="w14 w15 w16se w16cid w16 w16cex wp14">
+<w:endnotes xmlns:wpc="http://schemas.microsoft.com/office/word/2010/wordprocessingCanvas" xmlns:cx="http://schemas.microsoft.com/office/drawing/2014/chartex" xmlns:cx1="http://schemas.microsoft.com/office/drawing/2015/9/8/chartex" xmlns:cx2="http://schemas.microsoft.com/office/drawing/2015/10/21/chartex" xmlns:cx3="http://schemas.microsoft.com/office/drawing/2016/5/9/chartex" xmlns:cx4="http://schemas.microsoft.com/office/drawing/2016/5/10/chartex" xmlns:cx5="http://schemas.microsoft.com/office/drawing/2016/5/11/chartex" xmlns:cx6="http://schemas.microsoft.com/office/drawing/2016/5/12/chartex" xmlns:cx7="http://schemas.microsoft.com/office/drawing/2016/5/13/chartex" xmlns:cx8="http://schemas.microsoft.com/office/drawing/2016/5/14/chartex" xmlns:mc="http://schemas.openxmlformats.org/markup-compatibility/2006" xmlns:aink="http://schemas.microsoft.com/office/drawing/2016/ink" xmlns:am3d="http://schemas.microsoft.com/office/drawing/2017/model3d" xmlns:o="urn:schemas-microsoft-com:office:office" xmlns:oel="http://schemas.microsoft.com/office/2019/extlst" xmlns:r="http://schemas.openxmlformats.org/officeDocument/2006/relationships" xmlns:m="http://schemas.openxmlformats.org/officeDocument/2006/math" xmlns:v="urn:schemas-microsoft-com:vml" xmlns:wp14="http://schemas.microsoft.com/office/word/2010/wordprocessingDrawing" xmlns:wp="http://schemas.openxmlformats.org/drawingml/2006/wordprocessingDrawing" xmlns:w10="urn:schemas-microsoft-com:office:word" xmlns:w="http://schemas.openxmlformats.org/wordprocessingml/2006/main" xmlns:w14="http://schemas.microsoft.com/office/word/2010/wordml" xmlns:w15="http://schemas.microsoft.com/office/word/2012/wordml" xmlns:w16cex="http://schemas.microsoft.com/office/word/2018/wordml/cex" xmlns:w16cid="http://schemas.microsoft.com/office/word/2016/wordml/cid" xmlns:w16="http://schemas.microsoft.com/office/word/2018/wordml" xmlns:w16du="http://schemas.microsoft.com/office/word/2023/wordml/word16du" xmlns:w16sdtdh="http://schemas.microsoft.com/office/word/2020/wordml/sdtdatahash" xmlns:w16sdtfl="http://schemas.microsoft.com/office/word/2024/wordml/sdtformatlock" xmlns:w16se="http://schemas.microsoft.com/office/word/2015/wordml/symex" xmlns:wpg="http://schemas.microsoft.com/office/word/2010/wordprocessingGroup" xmlns:wpi="http://schemas.microsoft.com/office/word/2010/wordprocessingInk" xmlns:wne="http://schemas.microsoft.com/office/word/2006/wordml" xmlns:wps="http://schemas.microsoft.com/office/word/2010/wordprocessingShape" mc:Ignorable="w14 w15 w16se w16cid w16 w16cex w16sdtdh w16sdtfl w16du wp14">
   <w:endnote w:type="separator" w:id="-1">
     <w:p>
       <w:pPr>
@@ -2970,7 +2735,7 @@
 </file>
 
 <file path=word/footnotes.xml><?xml version="1.0" encoding="utf-8"?>
-<w:footnotes xmlns:wpc="http://schemas.microsoft.com/office/word/2010/wordprocessingCanvas" xmlns:cx="http://schemas.microsoft.com/office/drawing/2014/chartex" xmlns:cx1="http://schemas.microsoft.com/office/drawing/2015/9/8/chartex" xmlns:cx2="http://schemas.microsoft.com/office/drawing/2015/10/21/chartex" xmlns:cx3="http://schemas.microsoft.com/office/drawing/2016/5/9/chartex" xmlns:cx4="http://schemas.microsoft.com/office/drawing/2016/5/10/chartex" xmlns:cx5="http://schemas.microsoft.com/office/drawing/2016/5/11/chartex" xmlns:cx6="http://schemas.microsoft.com/office/drawing/2016/5/12/chartex" xmlns:cx7="http://schemas.microsoft.com/office/drawing/2016/5/13/chartex" xmlns:cx8="http://schemas.microsoft.com/office/drawing/2016/5/14/chartex" xmlns:mc="http://schemas.openxmlformats.org/markup-compatibility/2006" xmlns:aink="http://schemas.microsoft.com/office/drawing/2016/ink" xmlns:am3d="http://schemas.microsoft.com/office/drawing/2017/model3d" xmlns:o="urn:schemas-microsoft-com:office:office" xmlns:r="http://schemas.openxmlformats.org/officeDocument/2006/relationships" xmlns:m="http://schemas.openxmlformats.org/officeDocument/2006/math" xmlns:v="urn:schemas-microsoft-com:vml" xmlns:wp14="http://schemas.microsoft.com/office/word/2010/wordprocessingDrawing" xmlns:wp="http://schemas.openxmlformats.org/drawingml/2006/wordprocessingDrawing" xmlns:w10="urn:schemas-microsoft-com:office:word" xmlns:w="http://schemas.openxmlformats.org/wordprocessingml/2006/main" xmlns:w14="http://schemas.microsoft.com/office/word/2010/wordml" xmlns:w15="http://schemas.microsoft.com/office/word/2012/wordml" xmlns:w16cex="http://schemas.microsoft.com/office/word/2018/wordml/cex" xmlns:w16cid="http://schemas.microsoft.com/office/word/2016/wordml/cid" xmlns:w16="http://schemas.microsoft.com/office/word/2018/wordml" xmlns:w16se="http://schemas.microsoft.com/office/word/2015/wordml/symex" xmlns:wpg="http://schemas.microsoft.com/office/word/2010/wordprocessingGroup" xmlns:wpi="http://schemas.microsoft.com/office/word/2010/wordprocessingInk" xmlns:wne="http://schemas.microsoft.com/office/word/2006/wordml" xmlns:wps="http://schemas.microsoft.com/office/word/2010/wordprocessingShape" mc:Ignorable="w14 w15 w16se w16cid w16 w16cex wp14">
+<w:footnotes xmlns:wpc="http://schemas.microsoft.com/office/word/2010/wordprocessingCanvas" xmlns:cx="http://schemas.microsoft.com/office/drawing/2014/chartex" xmlns:cx1="http://schemas.microsoft.com/office/drawing/2015/9/8/chartex" xmlns:cx2="http://schemas.microsoft.com/office/drawing/2015/10/21/chartex" xmlns:cx3="http://schemas.microsoft.com/office/drawing/2016/5/9/chartex" xmlns:cx4="http://schemas.microsoft.com/office/drawing/2016/5/10/chartex" xmlns:cx5="http://schemas.microsoft.com/office/drawing/2016/5/11/chartex" xmlns:cx6="http://schemas.microsoft.com/office/drawing/2016/5/12/chartex" xmlns:cx7="http://schemas.microsoft.com/office/drawing/2016/5/13/chartex" xmlns:cx8="http://schemas.microsoft.com/office/drawing/2016/5/14/chartex" xmlns:mc="http://schemas.openxmlformats.org/markup-compatibility/2006" xmlns:aink="http://schemas.microsoft.com/office/drawing/2016/ink" xmlns:am3d="http://schemas.microsoft.com/office/drawing/2017/model3d" xmlns:o="urn:schemas-microsoft-com:office:office" xmlns:oel="http://schemas.microsoft.com/office/2019/extlst" xmlns:r="http://schemas.openxmlformats.org/officeDocument/2006/relationships" xmlns:m="http://schemas.openxmlformats.org/officeDocument/2006/math" xmlns:v="urn:schemas-microsoft-com:vml" xmlns:wp14="http://schemas.microsoft.com/office/word/2010/wordprocessingDrawing" xmlns:wp="http://schemas.openxmlformats.org/drawingml/2006/wordprocessingDrawing" xmlns:w10="urn:schemas-microsoft-com:office:word" xmlns:w="http://schemas.openxmlformats.org/wordprocessingml/2006/main" xmlns:w14="http://schemas.microsoft.com/office/word/2010/wordml" xmlns:w15="http://schemas.microsoft.com/office/word/2012/wordml" xmlns:w16cex="http://schemas.microsoft.com/office/word/2018/wordml/cex" xmlns:w16cid="http://schemas.microsoft.com/office/word/2016/wordml/cid" xmlns:w16="http://schemas.microsoft.com/office/word/2018/wordml" xmlns:w16du="http://schemas.microsoft.com/office/word/2023/wordml/word16du" xmlns:w16sdtdh="http://schemas.microsoft.com/office/word/2020/wordml/sdtdatahash" xmlns:w16sdtfl="http://schemas.microsoft.com/office/word/2024/wordml/sdtformatlock" xmlns:w16se="http://schemas.microsoft.com/office/word/2015/wordml/symex" xmlns:wpg="http://schemas.microsoft.com/office/word/2010/wordprocessingGroup" xmlns:wpi="http://schemas.microsoft.com/office/word/2010/wordprocessingInk" xmlns:wne="http://schemas.microsoft.com/office/word/2006/wordml" xmlns:wps="http://schemas.microsoft.com/office/word/2010/wordprocessingShape" mc:Ignorable="w14 w15 w16se w16cid w16 w16cex w16sdtdh w16sdtfl w16du wp14">
   <w:footnote w:type="separator" w:id="-1">
     <w:p>
       <w:pPr>
@@ -2995,7 +2760,7 @@
 </file>
 
 <file path=word/styles.xml><?xml version="1.0" encoding="utf-8"?>
-<w:styles xmlns:mc="http://schemas.openxmlformats.org/markup-compatibility/2006" xmlns:r="http://schemas.openxmlformats.org/officeDocument/2006/relationships" xmlns:w="http://schemas.openxmlformats.org/wordprocessingml/2006/main" xmlns:w14="http://schemas.microsoft.com/office/word/2010/wordml" xmlns:w15="http://schemas.microsoft.com/office/word/2012/wordml" xmlns:w16cex="http://schemas.microsoft.com/office/word/2018/wordml/cex" xmlns:w16cid="http://schemas.microsoft.com/office/word/2016/wordml/cid" xmlns:w16="http://schemas.microsoft.com/office/word/2018/wordml" xmlns:w16se="http://schemas.microsoft.com/office/word/2015/wordml/symex" mc:Ignorable="w14 w15 w16se w16cid w16 w16cex">
+<w:styles xmlns:mc="http://schemas.openxmlformats.org/markup-compatibility/2006" xmlns:r="http://schemas.openxmlformats.org/officeDocument/2006/relationships" xmlns:w="http://schemas.openxmlformats.org/wordprocessingml/2006/main" xmlns:w14="http://schemas.microsoft.com/office/word/2010/wordml" xmlns:w15="http://schemas.microsoft.com/office/word/2012/wordml" xmlns:w16cex="http://schemas.microsoft.com/office/word/2018/wordml/cex" xmlns:w16cid="http://schemas.microsoft.com/office/word/2016/wordml/cid" xmlns:w16="http://schemas.microsoft.com/office/word/2018/wordml" xmlns:w16du="http://schemas.microsoft.com/office/word/2023/wordml/word16du" xmlns:w16sdtdh="http://schemas.microsoft.com/office/word/2020/wordml/sdtdatahash" xmlns:w16sdtfl="http://schemas.microsoft.com/office/word/2024/wordml/sdtformatlock" xmlns:w16se="http://schemas.microsoft.com/office/word/2015/wordml/symex" mc:Ignorable="w14 w15 w16se w16cid w16 w16cex w16sdtdh w16sdtfl w16du">
   <w:docDefaults>
     <w:rPrDefault>
       <w:rPr>

</xml_diff>